<commit_message>
Update session data and vertical template
</commit_message>
<xml_diff>
--- a/src/core/generation/templates/vertical.docx
+++ b/src/core/generation/templates/vertical.docx
@@ -55,7 +55,7 @@
             <w:tr>
               <w:trPr>
                 <w:cantSplit/>
-                <w:trHeight w:hRule="exact" w:val="2880"/>
+                <w:trHeight w:hRule="exact" w:val="3013"/>
               </w:trPr>
               <w:tc>
                 <w:tcPr>
@@ -116,10 +116,9 @@
           <w:tbl>
             <w:tblPr>
               <w:tblStyle w:val="TableGrid"/>
-              <w:tblpPr w:vertAnchor="page" w:horzAnchor="margin" w:tblpXSpec="center" w:tblpY="3520"/>
+              <w:tblpPr w:vertAnchor="page" w:horzAnchor="margin" w:tblpXSpec="center" w:tblpY="3641"/>
               <w:tblOverlap w:val="never"/>
               <w:tblW w:w="3294" w:type="dxa"/>
-              <w:jc w:val="center"/>
               <w:tblBorders>
                 <w:insideH w:val="none" w:sz="0" w:space="0" w:color="auto"/>
                 <w:insideV w:val="none" w:sz="0" w:space="0" w:color="auto"/>
@@ -139,8 +138,7 @@
             <w:tr>
               <w:trPr>
                 <w:cantSplit/>
-                <w:trHeight w:val="1260"/>
-                <w:jc w:val="center"/>
+                <w:trHeight w:val="1170"/>
               </w:trPr>
               <w:tc>
                 <w:tcPr>
@@ -262,8 +260,8 @@
                 <w:rFonts w:ascii="Arial" w:hAnsi="Arial" w:cs="Arial"/>
                 <w:b/>
                 <w:bCs/>
-                <w:sz w:val="8"/>
-                <w:szCs w:val="8"/>
+                <w:sz w:val="10"/>
+                <w:szCs w:val="10"/>
               </w:rPr>
             </w:pPr>
             <w:r>
@@ -276,6 +274,19 @@
               </w:rPr>
               <w:t xml:space="preserve">{{Label1.Lineage}} </w:t>
             </w:r>
+          </w:p>
+          <w:p>
+            <w:pPr>
+              <w:spacing w:line="216" w:lineRule="auto"/>
+              <w:ind w:right="126"/>
+              <w:rPr>
+                <w:rFonts w:ascii="Arial" w:hAnsi="Arial" w:cs="Arial"/>
+                <w:b/>
+                <w:bCs/>
+                <w:sz w:val="8"/>
+                <w:szCs w:val="8"/>
+              </w:rPr>
+            </w:pPr>
             <w:r>
               <w:rPr>
                 <w:rFonts w:ascii="Arial" w:hAnsi="Arial" w:cs="Arial"/>

</xml_diff>

<commit_message>
Update vertical template with improved brand sizing
</commit_message>
<xml_diff>
--- a/src/core/generation/templates/vertical.docx
+++ b/src/core/generation/templates/vertical.docx
@@ -28,13 +28,18 @@
           <w:tcPr>
             <w:tcW w:w="3456" w:type="dxa"/>
             <w:noWrap/>
+            <w:tcMar>
+              <w:left w:w="58" w:type="dxa"/>
+              <w:right w:w="58" w:type="dxa"/>
+            </w:tcMar>
             <w:vAlign w:val="center"/>
           </w:tcPr>
           <w:tbl>
             <w:tblPr>
-              <w:tblpPr w:leftFromText="187" w:rightFromText="187" w:vertAnchor="page" w:horzAnchor="margin" w:tblpX="90" w:tblpY="76"/>
+              <w:tblpPr w:leftFromText="187" w:rightFromText="187" w:vertAnchor="page" w:horzAnchor="margin" w:tblpXSpec="center" w:tblpY="76"/>
               <w:tblOverlap w:val="never"/>
-              <w:tblW w:w="3240" w:type="dxa"/>
+              <w:tblW w:w="3330" w:type="dxa"/>
+              <w:jc w:val="center"/>
               <w:tblBorders>
                 <w:top w:val="single" w:sz="4" w:space="0" w:color="FFFFFF" w:themeColor="background1"/>
                 <w:left w:val="single" w:sz="4" w:space="0" w:color="FFFFFF" w:themeColor="background1"/>
@@ -50,16 +55,17 @@
               <w:tblLook w:val="0000" w:firstRow="0" w:lastRow="0" w:firstColumn="0" w:lastColumn="0" w:noHBand="0" w:noVBand="0"/>
             </w:tblPr>
             <w:tblGrid>
-              <w:gridCol w:w="3240"/>
+              <w:gridCol w:w="3330"/>
             </w:tblGrid>
             <w:tr>
               <w:trPr>
                 <w:cantSplit/>
                 <w:trHeight w:hRule="exact" w:val="3013"/>
+                <w:jc w:val="center"/>
               </w:trPr>
               <w:tc>
                 <w:tcPr>
-                  <w:tcW w:w="3240" w:type="dxa"/>
+                  <w:tcW w:w="3330" w:type="dxa"/>
                   <w:tcBorders>
                     <w:top w:val="nil"/>
                     <w:left w:val="nil"/>
@@ -118,7 +124,7 @@
               <w:tblStyle w:val="TableGrid"/>
               <w:tblpPr w:vertAnchor="page" w:horzAnchor="margin" w:tblpXSpec="center" w:tblpY="3641"/>
               <w:tblOverlap w:val="never"/>
-              <w:tblW w:w="3294" w:type="dxa"/>
+              <w:tblW w:w="3330" w:type="dxa"/>
               <w:tblBorders>
                 <w:insideH w:val="none" w:sz="0" w:space="0" w:color="auto"/>
                 <w:insideV w:val="none" w:sz="0" w:space="0" w:color="auto"/>
@@ -133,12 +139,12 @@
             <w:tblGrid>
               <w:gridCol w:w="1440"/>
               <w:gridCol w:w="810"/>
-              <w:gridCol w:w="1044"/>
+              <w:gridCol w:w="1080"/>
             </w:tblGrid>
             <w:tr>
               <w:trPr>
                 <w:cantSplit/>
-                <w:trHeight w:val="1170"/>
+                <w:trHeight w:val="1084"/>
               </w:trPr>
               <w:tc>
                 <w:tcPr>
@@ -200,7 +206,7 @@
               </w:tc>
               <w:tc>
                 <w:tcPr>
-                  <w:tcW w:w="1044" w:type="dxa"/>
+                  <w:tcW w:w="1080" w:type="dxa"/>
                   <w:tcBorders>
                     <w:top w:val="nil"/>
                     <w:bottom w:val="nil"/>
@@ -264,6 +270,19 @@
                 <w:szCs w:val="10"/>
               </w:rPr>
             </w:pPr>
+          </w:p>
+          <w:p>
+            <w:pPr>
+              <w:spacing w:line="216" w:lineRule="auto"/>
+              <w:ind w:right="126"/>
+              <w:rPr>
+                <w:rFonts w:ascii="Arial" w:hAnsi="Arial" w:cs="Arial"/>
+                <w:b/>
+                <w:bCs/>
+                <w:sz w:val="10"/>
+                <w:szCs w:val="10"/>
+              </w:rPr>
+            </w:pPr>
             <w:r>
               <w:rPr>
                 <w:rFonts w:ascii="Arial" w:hAnsi="Arial" w:cs="Arial"/>
@@ -273,6 +292,16 @@
                 <w:szCs w:val="10"/>
               </w:rPr>
               <w:t xml:space="preserve">{{Label1.Lineage}} </w:t>
+            </w:r>
+            <w:r>
+              <w:rPr>
+                <w:rFonts w:ascii="Arial" w:hAnsi="Arial" w:cs="Arial"/>
+                <w:b/>
+                <w:bCs/>
+                <w:sz w:val="10"/>
+                <w:szCs w:val="10"/>
+              </w:rPr>
+              <w:br/>
             </w:r>
           </w:p>
           <w:p>

</xml_diff>

<commit_message>
Update vertical template with CONSTELLATION brand font fix
</commit_message>
<xml_diff>
--- a/src/core/generation/templates/vertical.docx
+++ b/src/core/generation/templates/vertical.docx
@@ -270,19 +270,6 @@
                 <w:szCs w:val="10"/>
               </w:rPr>
             </w:pPr>
-          </w:p>
-          <w:p>
-            <w:pPr>
-              <w:spacing w:line="216" w:lineRule="auto"/>
-              <w:ind w:right="126"/>
-              <w:rPr>
-                <w:rFonts w:ascii="Arial" w:hAnsi="Arial" w:cs="Arial"/>
-                <w:b/>
-                <w:bCs/>
-                <w:sz w:val="10"/>
-                <w:szCs w:val="10"/>
-              </w:rPr>
-            </w:pPr>
             <w:r>
               <w:rPr>
                 <w:rFonts w:ascii="Arial" w:hAnsi="Arial" w:cs="Arial"/>
@@ -293,29 +280,6 @@
               </w:rPr>
               <w:t xml:space="preserve">{{Label1.Lineage}} </w:t>
             </w:r>
-            <w:r>
-              <w:rPr>
-                <w:rFonts w:ascii="Arial" w:hAnsi="Arial" w:cs="Arial"/>
-                <w:b/>
-                <w:bCs/>
-                <w:sz w:val="10"/>
-                <w:szCs w:val="10"/>
-              </w:rPr>
-              <w:br/>
-            </w:r>
-          </w:p>
-          <w:p>
-            <w:pPr>
-              <w:spacing w:line="216" w:lineRule="auto"/>
-              <w:ind w:right="126"/>
-              <w:rPr>
-                <w:rFonts w:ascii="Arial" w:hAnsi="Arial" w:cs="Arial"/>
-                <w:b/>
-                <w:bCs/>
-                <w:sz w:val="8"/>
-                <w:szCs w:val="8"/>
-              </w:rPr>
-            </w:pPr>
             <w:r>
               <w:rPr>
                 <w:rFonts w:ascii="Arial" w:hAnsi="Arial" w:cs="Arial"/>

</xml_diff>

<commit_message>
Update session and vertical template files
</commit_message>
<xml_diff>
--- a/src/core/generation/templates/vertical.docx
+++ b/src/core/generation/templates/vertical.docx
@@ -60,7 +60,7 @@
             <w:tr>
               <w:trPr>
                 <w:cantSplit/>
-                <w:trHeight w:hRule="exact" w:val="3013"/>
+                <w:trHeight w:hRule="exact" w:val="3103"/>
                 <w:jc w:val="center"/>
               </w:trPr>
               <w:tc>
@@ -122,9 +122,10 @@
           <w:tbl>
             <w:tblPr>
               <w:tblStyle w:val="TableGrid"/>
-              <w:tblpPr w:vertAnchor="page" w:horzAnchor="margin" w:tblpY="3711"/>
+              <w:tblpPr w:vertAnchor="page" w:horzAnchor="margin" w:tblpXSpec="center" w:tblpY="3711"/>
               <w:tblOverlap w:val="never"/>
               <w:tblW w:w="3330" w:type="dxa"/>
+              <w:jc w:val="center"/>
               <w:tblBorders>
                 <w:insideH w:val="none" w:sz="0" w:space="0" w:color="auto"/>
                 <w:insideV w:val="none" w:sz="0" w:space="0" w:color="auto"/>
@@ -144,7 +145,8 @@
             <w:tr>
               <w:trPr>
                 <w:cantSplit/>
-                <w:trHeight w:val="1084"/>
+                <w:trHeight w:hRule="exact" w:val="1080"/>
+                <w:jc w:val="center"/>
               </w:trPr>
               <w:tc>
                 <w:tcPr>

</xml_diff>

<commit_message>
Update session and vertical template files again
</commit_message>
<xml_diff>
--- a/src/core/generation/templates/vertical.docx
+++ b/src/core/generation/templates/vertical.docx
@@ -60,7 +60,7 @@
             <w:tr>
               <w:trPr>
                 <w:cantSplit/>
-                <w:trHeight w:hRule="exact" w:val="3103"/>
+                <w:trHeight w:hRule="exact" w:val="3013"/>
                 <w:jc w:val="center"/>
               </w:trPr>
               <w:tc>
@@ -122,10 +122,9 @@
           <w:tbl>
             <w:tblPr>
               <w:tblStyle w:val="TableGrid"/>
-              <w:tblpPr w:vertAnchor="page" w:horzAnchor="margin" w:tblpXSpec="center" w:tblpY="3711"/>
+              <w:tblpPr w:vertAnchor="page" w:horzAnchor="margin" w:tblpY="3651"/>
               <w:tblOverlap w:val="never"/>
               <w:tblW w:w="3330" w:type="dxa"/>
-              <w:jc w:val="center"/>
               <w:tblBorders>
                 <w:insideH w:val="none" w:sz="0" w:space="0" w:color="auto"/>
                 <w:insideV w:val="none" w:sz="0" w:space="0" w:color="auto"/>
@@ -145,8 +144,7 @@
             <w:tr>
               <w:trPr>
                 <w:cantSplit/>
-                <w:trHeight w:hRule="exact" w:val="1080"/>
-                <w:jc w:val="center"/>
+                <w:trHeight w:hRule="exact" w:val="987"/>
               </w:trPr>
               <w:tc>
                 <w:tcPr>
@@ -234,27 +232,7 @@
                       <w:sz w:val="13"/>
                       <w:szCs w:val="13"/>
                     </w:rPr>
-                    <w:t>{{Label1.</w:t>
-                  </w:r>
-                  <w:r>
-                    <w:rPr>
-                      <w:rFonts w:ascii="Arial" w:hAnsi="Arial" w:cs="Arial"/>
-                      <w:b/>
-                      <w:bCs/>
-                      <w:sz w:val="13"/>
-                      <w:szCs w:val="13"/>
-                    </w:rPr>
-                    <w:t>QR</w:t>
-                  </w:r>
-                  <w:r>
-                    <w:rPr>
-                      <w:rFonts w:ascii="Arial" w:hAnsi="Arial" w:cs="Arial"/>
-                      <w:b/>
-                      <w:bCs/>
-                      <w:sz w:val="13"/>
-                      <w:szCs w:val="13"/>
-                    </w:rPr>
-                    <w:t>}}</w:t>
+                    <w:t>{{Label1.QR}}</w:t>
                   </w:r>
                 </w:p>
               </w:tc>

</xml_diff>

<commit_message>
Fix double template garbage text and configure system to use AGT_Bothell database
- Removed marker wrappers (_START/_END) from placeholders in template_processor.py to fix garbage text in double templates
- Implemented proper singleton pattern for ProductDatabase to ensure consistent database state
- Configured get_product_database() to default to AGT_Bothell store database
- Fixed database showing 0 products issue in web application
- All template generation and database operations now working correctly with AGT_Bothell database (10,395 products)
</commit_message>
<xml_diff>
--- a/src/core/generation/templates/vertical.docx
+++ b/src/core/generation/templates/vertical.docx
@@ -55,7 +55,7 @@
             <w:tr>
               <w:trPr>
                 <w:cantSplit/>
-                <w:trHeight w:hRule="exact" w:val="3009"/>
+                <w:trHeight w:hRule="exact" w:val="3175"/>
               </w:trPr>
               <w:tc>
                 <w:tcPr>
@@ -118,13 +118,35 @@
               </w:tc>
             </w:tr>
           </w:tbl>
+          <w:p>
+            <w:pPr>
+              <w:spacing w:line="216" w:lineRule="auto"/>
+              <w:ind w:right="126"/>
+              <w:rPr>
+                <w:rFonts w:ascii="Arial" w:hAnsi="Arial" w:cs="Arial"/>
+                <w:b/>
+                <w:bCs/>
+                <w:sz w:val="10"/>
+                <w:szCs w:val="10"/>
+              </w:rPr>
+            </w:pPr>
+            <w:r>
+              <w:rPr>
+                <w:rFonts w:ascii="Arial" w:hAnsi="Arial" w:cs="Arial"/>
+                <w:b/>
+                <w:bCs/>
+                <w:sz w:val="10"/>
+                <w:szCs w:val="10"/>
+              </w:rPr>
+              <w:t xml:space="preserve">{{Label1.Lineage}} </w:t>
+            </w:r>
+          </w:p>
           <w:tbl>
             <w:tblPr>
               <w:tblStyle w:val="TableGrid"/>
-              <w:tblpPr w:vertAnchor="page" w:horzAnchor="margin" w:tblpXSpec="center" w:tblpY="3624"/>
+              <w:tblpPr w:vertAnchor="page" w:horzAnchor="margin" w:tblpXSpec="center" w:tblpY="3700"/>
               <w:tblOverlap w:val="never"/>
               <w:tblW w:w="3294" w:type="dxa"/>
-              <w:jc w:val="center"/>
               <w:tblBorders>
                 <w:insideH w:val="none" w:sz="0" w:space="0" w:color="auto"/>
                 <w:insideV w:val="none" w:sz="0" w:space="0" w:color="auto"/>
@@ -137,19 +159,18 @@
               <w:tblLook w:val="04A0" w:firstRow="1" w:lastRow="0" w:firstColumn="1" w:lastColumn="0" w:noHBand="0" w:noVBand="1"/>
             </w:tblPr>
             <w:tblGrid>
-              <w:gridCol w:w="1350"/>
+              <w:gridCol w:w="1440"/>
               <w:gridCol w:w="900"/>
-              <w:gridCol w:w="1044"/>
+              <w:gridCol w:w="954"/>
             </w:tblGrid>
             <w:tr>
               <w:trPr>
                 <w:cantSplit/>
-                <w:trHeight w:val="1168"/>
-                <w:jc w:val="center"/>
+                <w:trHeight w:val="1082"/>
               </w:trPr>
               <w:tc>
                 <w:tcPr>
-                  <w:tcW w:w="1350" w:type="dxa"/>
+                  <w:tcW w:w="1440" w:type="dxa"/>
                   <w:tcBorders>
                     <w:top w:val="nil"/>
                     <w:left w:val="nil"/>
@@ -157,14 +178,24 @@
                   </w:tcBorders>
                   <w:shd w:val="clear" w:color="auto" w:fill="FFFFFF" w:themeFill="background1"/>
                   <w:noWrap/>
+                  <w:tcMar>
+                    <w:left w:w="29" w:type="dxa"/>
+                    <w:right w:w="29" w:type="dxa"/>
+                  </w:tcMar>
                   <w:vAlign w:val="center"/>
                 </w:tcPr>
                 <w:p>
+                  <w:pPr>
+                    <w:rPr>
+                      <w:sz w:val="20"/>
+                      <w:szCs w:val="20"/>
+                    </w:rPr>
+                  </w:pPr>
                   <w:r>
                     <w:rPr>
                       <w:rFonts w:ascii="Arial" w:hAnsi="Arial" w:cs="Arial"/>
-                      <w:sz w:val="22"/>
-                      <w:szCs w:val="22"/>
+                      <w:sz w:val="20"/>
+                      <w:szCs w:val="20"/>
                       <w:shd w:val="clear" w:color="auto" w:fill="FFFFFF" w:themeFill="background1"/>
                     </w:rPr>
                     <w:t>{{Label1.Price}}</w:t>
@@ -207,7 +238,7 @@
               </w:tc>
               <w:tc>
                 <w:tcPr>
-                  <w:tcW w:w="1044" w:type="dxa"/>
+                  <w:tcW w:w="954" w:type="dxa"/>
                   <w:tcBorders>
                     <w:top w:val="nil"/>
                     <w:bottom w:val="nil"/>
@@ -215,6 +246,10 @@
                   </w:tcBorders>
                   <w:shd w:val="clear" w:color="auto" w:fill="FFFFFF" w:themeFill="background1"/>
                   <w:noWrap/>
+                  <w:tcMar>
+                    <w:left w:w="29" w:type="dxa"/>
+                    <w:right w:w="43" w:type="dxa"/>
+                  </w:tcMar>
                   <w:vAlign w:val="center"/>
                 </w:tcPr>
                 <w:p>
@@ -233,27 +268,7 @@
                       <w:sz w:val="13"/>
                       <w:szCs w:val="13"/>
                     </w:rPr>
-                    <w:t>{{Label1.</w:t>
-                  </w:r>
-                  <w:r>
-                    <w:rPr>
-                      <w:rFonts w:ascii="Arial" w:hAnsi="Arial" w:cs="Arial"/>
-                      <w:b/>
-                      <w:bCs/>
-                      <w:sz w:val="13"/>
-                      <w:szCs w:val="13"/>
-                    </w:rPr>
-                    <w:t>QR</w:t>
-                  </w:r>
-                  <w:r>
-                    <w:rPr>
-                      <w:rFonts w:ascii="Arial" w:hAnsi="Arial" w:cs="Arial"/>
-                      <w:b/>
-                      <w:bCs/>
-                      <w:sz w:val="13"/>
-                      <w:szCs w:val="13"/>
-                    </w:rPr>
-                    <w:t>}}</w:t>
+                    <w:t>{{Label1.QR}}</w:t>
                   </w:r>
                 </w:p>
               </w:tc>
@@ -267,73 +282,10 @@
                 <w:rFonts w:ascii="Arial" w:hAnsi="Arial" w:cs="Arial"/>
                 <w:b/>
                 <w:bCs/>
-                <w:sz w:val="10"/>
-                <w:szCs w:val="10"/>
-              </w:rPr>
-            </w:pPr>
-            <w:r>
-              <w:rPr>
-                <w:rFonts w:ascii="Arial" w:hAnsi="Arial" w:cs="Arial"/>
-                <w:b/>
-                <w:bCs/>
-                <w:sz w:val="10"/>
-                <w:szCs w:val="10"/>
-              </w:rPr>
-              <w:t xml:space="preserve">{{Label1.Lineage}} </w:t>
-            </w:r>
-          </w:p>
-          <w:p>
-            <w:pPr>
-              <w:spacing w:line="216" w:lineRule="auto"/>
-              <w:ind w:right="126"/>
-              <w:rPr>
-                <w:rFonts w:ascii="Arial" w:hAnsi="Arial" w:cs="Arial"/>
-                <w:b/>
-                <w:bCs/>
                 <w:sz w:val="8"/>
                 <w:szCs w:val="8"/>
               </w:rPr>
             </w:pPr>
-            <w:r>
-              <w:rPr>
-                <w:rFonts w:ascii="Arial" w:hAnsi="Arial" w:cs="Arial"/>
-                <w:b/>
-                <w:bCs/>
-                <w:sz w:val="10"/>
-                <w:szCs w:val="10"/>
-              </w:rPr>
-              <w:t>{{Label1.Product</w:t>
-            </w:r>
-            <w:r>
-              <w:rPr>
-                <w:rFonts w:ascii="Arial" w:hAnsi="Arial" w:cs="Arial"/>
-                <w:b/>
-                <w:bCs/>
-                <w:sz w:val="10"/>
-                <w:szCs w:val="10"/>
-              </w:rPr>
-              <w:t>Vendor</w:t>
-            </w:r>
-            <w:r>
-              <w:rPr>
-                <w:rFonts w:ascii="Arial" w:hAnsi="Arial" w:cs="Arial"/>
-                <w:b/>
-                <w:bCs/>
-                <w:sz w:val="10"/>
-                <w:szCs w:val="10"/>
-              </w:rPr>
-              <w:t>}}</w:t>
-            </w:r>
-            <w:r>
-              <w:rPr>
-                <w:rFonts w:ascii="Arial" w:hAnsi="Arial" w:cs="Arial"/>
-                <w:b/>
-                <w:bCs/>
-                <w:sz w:val="10"/>
-                <w:szCs w:val="10"/>
-              </w:rPr>
-              <w:t xml:space="preserve"> </w:t>
-            </w:r>
             <w:r>
               <w:rPr>
                 <w:rFonts w:ascii="Arial" w:hAnsi="Arial" w:cs="Arial"/>

</xml_diff>

<commit_message>
Enhanced UI: Made filter section more visible with larger fonts, better spacing, and improved styling. Centered template dropdown, added vertical spacing between buttons, brightened copyright text, and improved button visibility with purple gradient upload button
</commit_message>
<xml_diff>
--- a/src/core/generation/templates/vertical.docx
+++ b/src/core/generation/templates/vertical.docx
@@ -6,7 +6,7 @@
       <w:tblPr>
         <w:tblpPr w:leftFromText="187" w:rightFromText="187" w:vertAnchor="page" w:horzAnchor="page" w:tblpXSpec="center" w:tblpY="2084"/>
         <w:tblOverlap w:val="never"/>
-        <w:tblW w:w="0" w:type="dxa"/>
+        <w:tblW w:w="3456" w:type="dxa"/>
         <w:jc w:val="center"/>
         <w:tblLayout w:type="fixed"/>
         <w:tblCellMar>
@@ -38,7 +38,7 @@
             <w:tblPr>
               <w:tblpPr w:leftFromText="187" w:rightFromText="187" w:vertAnchor="page" w:horzAnchor="margin" w:tblpXSpec="center" w:tblpY="76"/>
               <w:tblOverlap w:val="never"/>
-              <w:tblW w:w="3240" w:type="dxa"/>
+              <w:tblW w:w="3312" w:type="dxa"/>
               <w:jc w:val="center"/>
               <w:tblBorders>
                 <w:top w:val="single" w:sz="4" w:space="0" w:color="FFFFFF" w:themeColor="background1"/>
@@ -55,7 +55,7 @@
               <w:tblLook w:val="0000" w:firstRow="0" w:lastRow="0" w:firstColumn="0" w:lastColumn="0" w:noHBand="0" w:noVBand="0"/>
             </w:tblPr>
             <w:tblGrid>
-              <w:gridCol w:w="3240"/>
+              <w:gridCol w:w="3312"/>
             </w:tblGrid>
             <w:tr>
               <w:trPr>
@@ -185,7 +185,7 @@
               <w:tblStyle w:val="TableGrid"/>
               <w:tblpPr w:vertAnchor="page" w:horzAnchor="margin" w:tblpXSpec="center" w:tblpY="3700"/>
               <w:tblOverlap w:val="never"/>
-              <w:tblW w:w="3294" w:type="dxa"/>
+              <w:tblW w:w="3330" w:type="dxa"/>
               <w:tblBorders>
                 <w:insideH w:val="none" w:sz="0" w:space="0" w:color="auto"/>
                 <w:insideV w:val="none" w:sz="0" w:space="0" w:color="auto"/>
@@ -200,7 +200,7 @@
             <w:tblGrid>
               <w:gridCol w:w="1440"/>
               <w:gridCol w:w="900"/>
-              <w:gridCol w:w="954"/>
+              <w:gridCol w:w="990"/>
             </w:tblGrid>
             <w:tr>
               <w:trPr>
@@ -277,7 +277,7 @@
               </w:tc>
               <w:tc>
                 <w:tcPr>
-                  <w:tcW w:w="954" w:type="dxa"/>
+                  <w:tcW w:w="990" w:type="dxa"/>
                   <w:tcBorders>
                     <w:top w:val="nil"/>
                     <w:bottom w:val="nil"/>

</xml_diff>

<commit_message>
Improve JSON vendor isolation and default file detection
</commit_message>
<xml_diff>
--- a/src/core/generation/templates/vertical.docx
+++ b/src/core/generation/templates/vertical.docx
@@ -60,7 +60,7 @@
             <w:tr>
               <w:trPr>
                 <w:cantSplit/>
-                <w:trHeight w:val="3053"/>
+                <w:trHeight w:val="3073"/>
                 <w:jc w:val="center"/>
               </w:trPr>
               <w:tc>
@@ -205,7 +205,7 @@
             <w:tr>
               <w:trPr>
                 <w:cantSplit/>
-                <w:trHeight w:val="1109"/>
+                <w:trHeight w:hRule="exact" w:val="1109"/>
               </w:trPr>
               <w:tc>
                 <w:tcPr>

</xml_diff>

<commit_message>
User save: autosave before push
</commit_message>
<xml_diff>
--- a/src/core/generation/templates/vertical.docx
+++ b/src/core/generation/templates/vertical.docx
@@ -144,7 +144,7 @@
                 <w:sz w:val="10"/>
                 <w:szCs w:val="10"/>
               </w:rPr>
-              <w:t>{{Label1.Lineage}}</w:t>
+              <w:t>{{Label1.Lineage}</w:t>
             </w:r>
             <w:r>
               <w:rPr>
@@ -154,37 +154,7 @@
                 <w:sz w:val="10"/>
                 <w:szCs w:val="10"/>
               </w:rPr>
-              <w:t xml:space="preserve"> </w:t>
-            </w:r>
-            <w:r>
-              <w:rPr>
-                <w:rFonts w:ascii="Arial" w:hAnsi="Arial" w:cs="Arial"/>
-                <w:b/>
-                <w:bCs/>
-                <w:sz w:val="8"/>
-                <w:szCs w:val="8"/>
-              </w:rPr>
-              <w:t>{{Label1.Product</w:t>
-            </w:r>
-            <w:r>
-              <w:rPr>
-                <w:rFonts w:ascii="Arial" w:hAnsi="Arial" w:cs="Arial"/>
-                <w:b/>
-                <w:bCs/>
-                <w:sz w:val="8"/>
-                <w:szCs w:val="8"/>
-              </w:rPr>
-              <w:t>Vendor</w:t>
-            </w:r>
-            <w:r>
-              <w:rPr>
-                <w:rFonts w:ascii="Arial" w:hAnsi="Arial" w:cs="Arial"/>
-                <w:b/>
-                <w:bCs/>
-                <w:sz w:val="8"/>
-                <w:szCs w:val="8"/>
-              </w:rPr>
-              <w:t>}}</w:t>
+              <w:t>}</w:t>
             </w:r>
           </w:p>
           <w:p>

</xml_diff>

<commit_message>
UI/logic fixes: lineage abbreviations, center product brand, misc cleanup
</commit_message>
<xml_diff>
--- a/src/core/generation/templates/vertical.docx
+++ b/src/core/generation/templates/vertical.docx
@@ -29,8 +29,8 @@
             <w:tcW w:w="3456" w:type="dxa"/>
             <w:noWrap/>
             <w:tcMar>
-              <w:left w:w="29" w:type="dxa"/>
-              <w:right w:w="29" w:type="dxa"/>
+              <w:left w:w="58" w:type="dxa"/>
+              <w:right w:w="58" w:type="dxa"/>
             </w:tcMar>
             <w:vAlign w:val="center"/>
           </w:tcPr>
@@ -203,6 +203,16 @@
               </w:rPr>
               <w:t>}</w:t>
             </w:r>
+            <w:r>
+              <w:rPr>
+                <w:rFonts w:ascii="Arial" w:hAnsi="Arial" w:cs="Arial"/>
+                <w:b/>
+                <w:bCs/>
+                <w:sz w:val="10"/>
+                <w:szCs w:val="10"/>
+              </w:rPr>
+              <w:t xml:space="preserve"> </w:t>
+            </w:r>
           </w:p>
           <w:p>
             <w:pPr>
@@ -224,7 +234,17 @@
                 <w:sz w:val="10"/>
                 <w:szCs w:val="10"/>
               </w:rPr>
-              <w:t>{{Label1.ProductStrain}}</w:t>
+              <w:t>{</w:t>
+            </w:r>
+            <w:r>
+              <w:rPr>
+                <w:rFonts w:ascii="Arial" w:hAnsi="Arial" w:cs="Arial"/>
+                <w:b/>
+                <w:bCs/>
+                <w:sz w:val="10"/>
+                <w:szCs w:val="10"/>
+              </w:rPr>
+              <w:t>{Label1.ProductStrain}}</w:t>
             </w:r>
           </w:p>
           <w:tbl>
@@ -252,7 +272,7 @@
             <w:tr>
               <w:trPr>
                 <w:cantSplit/>
-                <w:trHeight w:hRule="exact" w:val="1109"/>
+                <w:trHeight w:hRule="exact" w:val="1051"/>
               </w:trPr>
               <w:tc>
                 <w:tcPr>

</xml_diff>

<commit_message>
Add lineage fixes, docs, deployment updates, and cleanup
Co-authored-by: Cursor <cursoragent@cursor.com>
</commit_message>
<xml_diff>
--- a/src/core/generation/templates/vertical.docx
+++ b/src/core/generation/templates/vertical.docx
@@ -40,14 +40,7 @@
               <w:tblOverlap w:val="never"/>
               <w:tblW w:w="3312" w:type="dxa"/>
               <w:jc w:val="center"/>
-              <w:tblBorders>
-                <w:top w:val="single" w:sz="4" w:space="0" w:color="FFFFFF" w:themeColor="background1"/>
-                <w:left w:val="single" w:sz="4" w:space="0" w:color="FFFFFF" w:themeColor="background1"/>
-                <w:bottom w:val="single" w:sz="4" w:space="0" w:color="FFFFFF" w:themeColor="background1"/>
-                <w:right w:val="single" w:sz="4" w:space="0" w:color="FFFFFF" w:themeColor="background1"/>
-                <w:insideH w:val="single" w:sz="4" w:space="0" w:color="FFFFFF" w:themeColor="background1"/>
-                <w:insideV w:val="single" w:sz="4" w:space="0" w:color="FFFFFF" w:themeColor="background1"/>
-              </w:tblBorders>
+              <w:shd w:val="clear" w:color="auto" w:fill="FFFFFF" w:themeFill="background1"/>
               <w:tblLayout w:type="fixed"/>
               <w:tblCellMar>
                 <w:top w:w="43" w:type="dxa"/>
@@ -60,18 +53,12 @@
             <w:tr>
               <w:trPr>
                 <w:cantSplit/>
-                <w:trHeight w:hRule="exact" w:val="2880"/>
+                <w:trHeight w:hRule="exact" w:val="2952"/>
                 <w:jc w:val="center"/>
               </w:trPr>
               <w:tc>
                 <w:tcPr>
                   <w:tcW w:w="3312" w:type="dxa"/>
-                  <w:tcBorders>
-                    <w:top w:val="nil"/>
-                    <w:left w:val="nil"/>
-                    <w:bottom w:val="nil"/>
-                    <w:right w:val="nil"/>
-                  </w:tcBorders>
                   <w:shd w:val="clear" w:color="auto" w:fill="FFFFFF" w:themeFill="background1"/>
                   <w:tcMar>
                     <w:top w:w="29" w:type="dxa"/>
@@ -132,12 +119,6 @@
               <w:tc>
                 <w:tcPr>
                   <w:tcW w:w="3312" w:type="dxa"/>
-                  <w:tcBorders>
-                    <w:top w:val="nil"/>
-                    <w:left w:val="nil"/>
-                    <w:bottom w:val="nil"/>
-                    <w:right w:val="nil"/>
-                  </w:tcBorders>
                   <w:shd w:val="clear" w:color="auto" w:fill="FFFFFF" w:themeFill="background1"/>
                   <w:tcMar>
                     <w:top w:w="29" w:type="dxa"/>
@@ -216,8 +197,8 @@
           </w:p>
           <w:p>
             <w:pPr>
-              <w:spacing w:after="0" w:line="216" w:lineRule="auto"/>
-              <w:ind w:right="130"/>
+              <w:spacing w:line="216" w:lineRule="auto"/>
+              <w:ind w:right="126"/>
               <w:rPr>
                 <w:rFonts w:ascii="Arial" w:hAnsi="Arial" w:cs="Arial"/>
                 <w:b/>
@@ -250,7 +231,7 @@
           <w:tbl>
             <w:tblPr>
               <w:tblStyle w:val="TableGrid"/>
-              <w:tblpPr w:vertAnchor="page" w:horzAnchor="margin" w:tblpXSpec="center" w:tblpY="3702"/>
+              <w:tblpPr w:vertAnchor="page" w:horzAnchor="margin" w:tblpXSpec="center" w:tblpY="3700"/>
               <w:tblOverlap w:val="never"/>
               <w:tblW w:w="3330" w:type="dxa"/>
               <w:tblBorders>
@@ -382,8 +363,8 @@
           </w:tbl>
           <w:p>
             <w:pPr>
-              <w:spacing w:after="0" w:line="216" w:lineRule="auto"/>
-              <w:ind w:right="130"/>
+              <w:spacing w:line="216" w:lineRule="auto"/>
+              <w:ind w:right="126"/>
               <w:rPr>
                 <w:rFonts w:ascii="Arial" w:hAnsi="Arial" w:cs="Arial"/>
                 <w:b/>

</xml_diff>

<commit_message>
Fix PC version stuck on loading; lineage/matcher/template updates
Co-authored-by: Cursor <cursoragent@cursor.com>
</commit_message>
<xml_diff>
--- a/src/core/generation/templates/vertical.docx
+++ b/src/core/generation/templates/vertical.docx
@@ -40,7 +40,14 @@
               <w:tblOverlap w:val="never"/>
               <w:tblW w:w="3312" w:type="dxa"/>
               <w:jc w:val="center"/>
-              <w:shd w:val="clear" w:color="auto" w:fill="FFFFFF" w:themeFill="background1"/>
+              <w:tblBorders>
+                <w:top w:val="single" w:sz="4" w:space="0" w:color="FFFFFF" w:themeColor="background1"/>
+                <w:left w:val="single" w:sz="4" w:space="0" w:color="FFFFFF" w:themeColor="background1"/>
+                <w:bottom w:val="single" w:sz="4" w:space="0" w:color="FFFFFF" w:themeColor="background1"/>
+                <w:right w:val="single" w:sz="4" w:space="0" w:color="FFFFFF" w:themeColor="background1"/>
+                <w:insideH w:val="single" w:sz="4" w:space="0" w:color="FFFFFF" w:themeColor="background1"/>
+                <w:insideV w:val="single" w:sz="4" w:space="0" w:color="FFFFFF" w:themeColor="background1"/>
+              </w:tblBorders>
               <w:tblLayout w:type="fixed"/>
               <w:tblCellMar>
                 <w:top w:w="43" w:type="dxa"/>
@@ -53,12 +60,18 @@
             <w:tr>
               <w:trPr>
                 <w:cantSplit/>
-                <w:trHeight w:hRule="exact" w:val="2952"/>
+                <w:trHeight w:hRule="exact" w:val="2880"/>
                 <w:jc w:val="center"/>
               </w:trPr>
               <w:tc>
                 <w:tcPr>
                   <w:tcW w:w="3312" w:type="dxa"/>
+                  <w:tcBorders>
+                    <w:top w:val="nil"/>
+                    <w:left w:val="nil"/>
+                    <w:bottom w:val="nil"/>
+                    <w:right w:val="nil"/>
+                  </w:tcBorders>
                   <w:shd w:val="clear" w:color="auto" w:fill="FFFFFF" w:themeFill="background1"/>
                   <w:tcMar>
                     <w:top w:w="29" w:type="dxa"/>
@@ -119,6 +132,12 @@
               <w:tc>
                 <w:tcPr>
                   <w:tcW w:w="3312" w:type="dxa"/>
+                  <w:tcBorders>
+                    <w:top w:val="nil"/>
+                    <w:left w:val="nil"/>
+                    <w:bottom w:val="nil"/>
+                    <w:right w:val="nil"/>
+                  </w:tcBorders>
                   <w:shd w:val="clear" w:color="auto" w:fill="FFFFFF" w:themeFill="background1"/>
                   <w:tcMar>
                     <w:top w:w="29" w:type="dxa"/>
@@ -253,7 +272,7 @@
             <w:tr>
               <w:trPr>
                 <w:cantSplit/>
-                <w:trHeight w:hRule="exact" w:val="1080"/>
+                <w:trHeight w:hRule="exact" w:val="1051"/>
               </w:trPr>
               <w:tc>
                 <w:tcPr>

</xml_diff>

<commit_message>
Cleanup scripts, matcher and product database updates, template changes
Co-authored-by: Cursor <cursoragent@cursor.com>
</commit_message>
<xml_diff>
--- a/src/core/generation/templates/vertical.docx
+++ b/src/core/generation/templates/vertical.docx
@@ -40,14 +40,7 @@
               <w:tblOverlap w:val="never"/>
               <w:tblW w:w="3312" w:type="dxa"/>
               <w:jc w:val="center"/>
-              <w:tblBorders>
-                <w:top w:val="single" w:sz="4" w:space="0" w:color="FFFFFF" w:themeColor="background1"/>
-                <w:left w:val="single" w:sz="4" w:space="0" w:color="FFFFFF" w:themeColor="background1"/>
-                <w:bottom w:val="single" w:sz="4" w:space="0" w:color="FFFFFF" w:themeColor="background1"/>
-                <w:right w:val="single" w:sz="4" w:space="0" w:color="FFFFFF" w:themeColor="background1"/>
-                <w:insideH w:val="single" w:sz="4" w:space="0" w:color="FFFFFF" w:themeColor="background1"/>
-                <w:insideV w:val="single" w:sz="4" w:space="0" w:color="FFFFFF" w:themeColor="background1"/>
-              </w:tblBorders>
+              <w:shd w:val="clear" w:color="auto" w:fill="FFFFFF" w:themeFill="background1"/>
               <w:tblLayout w:type="fixed"/>
               <w:tblCellMar>
                 <w:top w:w="43" w:type="dxa"/>
@@ -60,18 +53,12 @@
             <w:tr>
               <w:trPr>
                 <w:cantSplit/>
-                <w:trHeight w:hRule="exact" w:val="2880"/>
+                <w:trHeight w:hRule="exact" w:val="2952"/>
                 <w:jc w:val="center"/>
               </w:trPr>
               <w:tc>
                 <w:tcPr>
                   <w:tcW w:w="3312" w:type="dxa"/>
-                  <w:tcBorders>
-                    <w:top w:val="nil"/>
-                    <w:left w:val="nil"/>
-                    <w:bottom w:val="nil"/>
-                    <w:right w:val="nil"/>
-                  </w:tcBorders>
                   <w:shd w:val="clear" w:color="auto" w:fill="FFFFFF" w:themeFill="background1"/>
                   <w:tcMar>
                     <w:top w:w="29" w:type="dxa"/>
@@ -132,12 +119,6 @@
               <w:tc>
                 <w:tcPr>
                   <w:tcW w:w="3312" w:type="dxa"/>
-                  <w:tcBorders>
-                    <w:top w:val="nil"/>
-                    <w:left w:val="nil"/>
-                    <w:bottom w:val="nil"/>
-                    <w:right w:val="nil"/>
-                  </w:tcBorders>
                   <w:shd w:val="clear" w:color="auto" w:fill="FFFFFF" w:themeFill="background1"/>
                   <w:tcMar>
                     <w:top w:w="29" w:type="dxa"/>
@@ -272,7 +253,7 @@
             <w:tr>
               <w:trPr>
                 <w:cantSplit/>
-                <w:trHeight w:hRule="exact" w:val="1051"/>
+                <w:trHeight w:hRule="exact" w:val="1080"/>
               </w:trPr>
               <w:tc>
                 <w:tcPr>

</xml_diff>